<commit_message>
feat(dashboard): transformasi modern white dashboard, integrasi 120 dataset nyata, dan revisi metodologi proposal
</commit_message>
<xml_diff>
--- a/Proposal Komputasi Paralel.docx
+++ b/Proposal Komputasi Paralel.docx
@@ -3662,24 +3662,7 @@
         </w:rPr>
       </w:pPr>
       <w:r>
-        <w:rPr>
-          <w:lang w:eastAsia="en-ID"/>
-        </w:rPr>
-        <w:t xml:space="preserve">Penyiapan </w:t>
-      </w:r>
-      <w:r>
-        <w:rPr>
-          <w:i/>
-          <w:iCs/>
-          <w:lang w:eastAsia="en-ID"/>
-        </w:rPr>
-        <w:t>dataset</w:t>
-      </w:r>
-      <w:r>
-        <w:rPr>
-          <w:lang w:eastAsia="en-ID"/>
-        </w:rPr>
-        <w:t xml:space="preserve"> citra uji, yaitu penyeragaman citra masukan berformat RGB tanpa kompresi pada dimensi 512 × 512, 1024 × 1024, 2048 × 2048, dan 4096 × 4096 piksel dengan sebaran warna yang identik.</w:t>
+        <w:t xml:space="preserve">3. Penyiapan dataset citra uji, yaitu pengumpulan dan standardisasi 30 sampel citra fotografi nyata beresolusi tinggi (4K hingga 8K) yang bersumber dari repositori fotografi terbuka (Aesthetic-4K). Setiap citra dipotong secara terpusat (center-crop) tanpa kompresi ke dalam empat tingkatan resolusi spasial: 512 × 512, 1024 × 1024, 2048 × 2048, dan 4096 × 4096 piksel, sehingga menghasilkan total 120 berkas citra multiresolusi untuk merepresentasikan keberagaman tekstur, gradien pencahayaan, dan entropi spasial alami.</w:t>
       </w:r>
     </w:p>
     <w:p>
@@ -3695,22 +3678,7 @@
         </w:rPr>
       </w:pPr>
       <w:r>
-        <w:rPr>
-          <w:lang w:eastAsia="en-ID"/>
-        </w:rPr>
-        <w:t>Eksekusi eksperimen terkontrol, yaitu pengujian algoritma pada sistem operasi tanpa aplikasi latar belakang yang berat. Setiap kombinasi perlakuan pengujian dieksekusi sebanyak satu kali secara deterministik pada citra uji standar untuk mengukur durasi komputasi murni.</w:t>
-      </w:r>
-      <w:r>
-        <w:rPr>
-          <w:i/>
-          <w:iCs/>
-          <w:lang w:eastAsia="en-ID"/>
-        </w:rPr>
-      </w:r>
-      <w:r>
-        <w:rPr>
-          <w:lang w:eastAsia="en-ID"/>
-        </w:rPr>
+        <w:t xml:space="preserve">4. Eksekusi eksperimen terkontrol, yaitu pengujian algoritma pada sistem operasi tanpa aplikasi latar belakang yang membebani CPU. Setiap kombinasi perlakuan pengujian dieksekusi terhadap 30 sampel citra independen pada masing-masing tingkatan resolusi guna memperoleh data empiris yang representatif. Pengukuran durasi komputasi murni memanfaatkan arsitektur pre-warmed pool untuk meniadakan penalti inisialisasi proses (cold spawn) pada Windows.</w:t>
       </w:r>
     </w:p>
     <w:p>
@@ -4071,7 +4039,7 @@
               <w:jc w:val="center"/>
             </w:pPr>
             <w:r>
-              <w:t>Jumlah Pengujian</w:t>
+              <w:t xml:space="preserve">Sampel Uji Citra</w:t>
             </w:r>
           </w:p>
         </w:tc>
@@ -4224,16 +4192,7 @@
               </w:rPr>
             </w:pPr>
             <w:r>
-              <w:rPr>
-                <w:rStyle w:val="katex-mathml"/>
-              </w:rPr>
-              <w:t>1</w:t>
-            </w:r>
-            <w:r>
-              <w:rPr>
-                <w:rStyle w:val="katex-mathml"/>
-              </w:rPr>
-              <w:t xml:space="preserve"> Kali</w:t>
+              <w:t xml:space="preserve">30 Berkas Nyata</w:t>
             </w:r>
           </w:p>
         </w:tc>
@@ -4386,16 +4345,7 @@
               </w:rPr>
             </w:pPr>
             <w:r>
-              <w:rPr>
-                <w:rStyle w:val="katex-mathml"/>
-              </w:rPr>
-              <w:t>1</w:t>
-            </w:r>
-            <w:r>
-              <w:rPr>
-                <w:rStyle w:val="katex-mathml"/>
-              </w:rPr>
-              <w:t xml:space="preserve"> Kali</w:t>
+              <w:t xml:space="preserve">30 Berkas Nyata</w:t>
             </w:r>
           </w:p>
         </w:tc>
@@ -4545,16 +4495,7 @@
               </w:rPr>
             </w:pPr>
             <w:r>
-              <w:rPr>
-                <w:rStyle w:val="katex-mathml"/>
-              </w:rPr>
-              <w:t>1</w:t>
-            </w:r>
-            <w:r>
-              <w:rPr>
-                <w:rStyle w:val="katex-mathml"/>
-              </w:rPr>
-              <w:t xml:space="preserve"> Kali</w:t>
+              <w:t xml:space="preserve">30 Berkas Nyata</w:t>
             </w:r>
           </w:p>
         </w:tc>
@@ -4698,16 +4639,7 @@
               </w:rPr>
             </w:pPr>
             <w:r>
-              <w:rPr>
-                <w:rStyle w:val="katex-mathml"/>
-              </w:rPr>
-              <w:t>1</w:t>
-            </w:r>
-            <w:r>
-              <w:rPr>
-                <w:rStyle w:val="katex-mathml"/>
-              </w:rPr>
-              <w:t xml:space="preserve"> Kali</w:t>
+              <w:t xml:space="preserve">30 Berkas Nyata</w:t>
             </w:r>
           </w:p>
         </w:tc>
@@ -4863,7 +4795,7 @@
               <w:jc w:val="center"/>
             </w:pPr>
             <w:r>
-              <w:t>Jumlah Pengujian</w:t>
+              <w:t xml:space="preserve">Sampel Uji Citra</w:t>
             </w:r>
           </w:p>
         </w:tc>
@@ -4996,16 +4928,7 @@
               </w:rPr>
             </w:pPr>
             <w:r>
-              <w:rPr>
-                <w:rStyle w:val="katex-mathml"/>
-              </w:rPr>
-              <w:t>1</w:t>
-            </w:r>
-            <w:r>
-              <w:rPr>
-                <w:rStyle w:val="katex-mathml"/>
-              </w:rPr>
-              <w:t xml:space="preserve"> Kali</w:t>
+              <w:t xml:space="preserve">30 Berkas Nyata</w:t>
             </w:r>
           </w:p>
         </w:tc>
@@ -5145,16 +5068,7 @@
               </w:rPr>
             </w:pPr>
             <w:r>
-              <w:rPr>
-                <w:rStyle w:val="katex-mathml"/>
-              </w:rPr>
-              <w:t>1</w:t>
-            </w:r>
-            <w:r>
-              <w:rPr>
-                <w:rStyle w:val="katex-mathml"/>
-              </w:rPr>
-              <w:t xml:space="preserve"> Kali</w:t>
+              <w:t xml:space="preserve">30 Berkas Nyata</w:t>
             </w:r>
           </w:p>
         </w:tc>
@@ -5294,16 +5208,7 @@
               </w:rPr>
             </w:pPr>
             <w:r>
-              <w:rPr>
-                <w:rStyle w:val="katex-mathml"/>
-              </w:rPr>
-              <w:t>1</w:t>
-            </w:r>
-            <w:r>
-              <w:rPr>
-                <w:rStyle w:val="katex-mathml"/>
-              </w:rPr>
-              <w:t xml:space="preserve"> Kali</w:t>
+              <w:t xml:space="preserve">30 Berkas Nyata</w:t>
             </w:r>
           </w:p>
         </w:tc>
@@ -5458,16 +5363,7 @@
               </w:rPr>
             </w:pPr>
             <w:r>
-              <w:rPr>
-                <w:rStyle w:val="katex-mathml"/>
-              </w:rPr>
-              <w:t>1</w:t>
-            </w:r>
-            <w:r>
-              <w:rPr>
-                <w:rStyle w:val="katex-mathml"/>
-              </w:rPr>
-              <w:t xml:space="preserve"> Kali</w:t>
+              <w:t xml:space="preserve">30 Berkas Nyata</w:t>
             </w:r>
           </w:p>
         </w:tc>
@@ -5905,7 +5801,7 @@
     </w:p>
     <w:p>
       <w:r>
-        <w:t>Efektivitas komputasi paralel dievaluasi melalui lima parameter kinerja pada Tabel 4. Waktu eksekusi yang dipakai untuk menghitung percepatan dan efisiensi diperoleh dari hasil satu kali pengujian terkontrol pada masing-masing kombinasi perlakuan.</w:t>
+        <w:t xml:space="preserve">Efektivitas komputasi paralel dievaluasi melalui lima parameter kinerja pada Tabel 4. Waktu eksekusi yang dipakai untuk menghitung percepatan dan efisiensi diperoleh dari nilai rata-rata (mean, μ) beserta standar deviasi (σ) dari pengujian 30 berkas citra independen pada masing-masing kombinasi perlakuan.</w:t>
       </w:r>
     </w:p>
     <w:p/>

</xml_diff>

<commit_message>
docs(proposal): sync docx with 30x repetitions single master image methodology
- Update Section 9.1 stages 3 & 4 with single master image center-crop and CLT 30x repetitions
- Update Table 1 and Table 2 replication columns to 1 Citra Acuan Master (30x Repetisi)
- Align docx proposal directly with Proposal Komputasi Paralel.md
</commit_message>
<xml_diff>
--- a/Proposal Komputasi Paralel.docx
+++ b/Proposal Komputasi Paralel.docx
@@ -3662,7 +3662,10 @@
         </w:rPr>
       </w:pPr>
       <w:r>
-        <w:t xml:space="preserve">3. Penyiapan dataset citra uji, yaitu pengumpulan dan standardisasi 30 sampel citra fotografi nyata beresolusi tinggi (4K hingga 8K) yang bersumber dari repositori fotografi terbuka (Aesthetic-4K). Setiap citra dipotong secara terpusat (center-crop) tanpa kompresi ke dalam empat tingkatan resolusi spasial: 512 × 512, 1024 × 1024, 2048 × 2048, dan 4096 × 4096 piksel, sehingga menghasilkan total 120 berkas citra multiresolusi untuk merepresentasikan keberagaman tekstur, gradien pencahayaan, dan entropi spasial alami.</w:t>
+        <w:t xml:space="preserve">3. Penyiapan dataset citra uji, yaitu </w:t>
+      </w:r>
+      <w:r>
+        <w:t xml:space="preserve">standardisasi citra acuan master fotografi beresolusi tinggi 4K (4096 × 4096 piksel) yang bersumber dari repositori fotografi terbuka (Aesthetic-4K). Citra acuan master tersebut dipotong secara terpusat (center-crop) tanpa kompresi ke dalam empat tingkatan resolusi spasial: 512 × 512, 1024 × 1024, 2048 × 2048, dan 4096 × 4096 piksel. Pendekatan citra acuan tunggal multiresolusi ini diterapkan guna meniadakan variabilitas struktur piksel antar-berkas, sehingga setiap perlakuan komputasi dievaluasi pada struktur matriks yang konsisten dan terkontrol. Seluruh 30 sampel citra multiresolusi awal tetap diarsipkan sebagai opsi dataset alternatif.</w:t>
       </w:r>
     </w:p>
     <w:p>
@@ -3678,7 +3681,10 @@
         </w:rPr>
       </w:pPr>
       <w:r>
-        <w:t xml:space="preserve">4. Eksekusi eksperimen terkontrol, yaitu pengujian algoritma pada sistem operasi tanpa aplikasi latar belakang yang membebani CPU. Setiap kombinasi perlakuan pengujian dieksekusi terhadap 30 sampel citra independen pada masing-masing tingkatan resolusi guna memperoleh data empiris yang representatif. Pengukuran durasi komputasi murni memanfaatkan arsitektur pre-warmed pool untuk meniadakan penalti inisialisasi proses (cold spawn) pada Windows.</w:t>
+        <w:t xml:space="preserve">4. Eksekusi eksperimen terkontrol, yaitu pengujian algoritma pada sistem operasi tanpa aplikasi latar belakang yang membebani CPU. Setiap kombinasi perlakuan pengujian dieksekusi </w:t>
+      </w:r>
+      <w:r>
+        <w:t xml:space="preserve">sebanyak 30 kali repetisi terkontrol pada masing-masing tingkatan resolusi guna memenuhi kaidah Central Limit Theorem (CLT) untuk memperoleh estimasi parameter rata-rata (mean) dan deviasi standar yang stabil dan representatif. Pengukuran durasi komputasi murni memanfaatkan arsitektur pre-warmed pool untuk meniadakan penalti inisialisasi proses (cold spawn) pada Windows, serta dilengkapi jeda pendinginan termal CPU (cool-down buffer) antar-filter guna mencegah pelambatan termal (thermal throttling).</w:t>
       </w:r>
     </w:p>
     <w:p>
@@ -4039,7 +4045,7 @@
               <w:jc w:val="center"/>
             </w:pPr>
             <w:r>
-              <w:t xml:space="preserve">Sampel Uji Citra</w:t>
+              <w:t xml:space="preserve">Replikasi Pengujian</w:t>
             </w:r>
           </w:p>
         </w:tc>
@@ -4192,7 +4198,7 @@
               </w:rPr>
             </w:pPr>
             <w:r>
-              <w:t xml:space="preserve">30 Berkas Nyata</w:t>
+              <w:t xml:space="preserve">1 Citra Acuan Master (30x Repetisi)</w:t>
             </w:r>
           </w:p>
         </w:tc>
@@ -4345,7 +4351,7 @@
               </w:rPr>
             </w:pPr>
             <w:r>
-              <w:t xml:space="preserve">30 Berkas Nyata</w:t>
+              <w:t xml:space="preserve">1 Citra Acuan Master (30x Repetisi)</w:t>
             </w:r>
           </w:p>
         </w:tc>
@@ -4495,7 +4501,7 @@
               </w:rPr>
             </w:pPr>
             <w:r>
-              <w:t xml:space="preserve">30 Berkas Nyata</w:t>
+              <w:t xml:space="preserve">1 Citra Acuan Master (30x Repetisi)</w:t>
             </w:r>
           </w:p>
         </w:tc>
@@ -4639,7 +4645,7 @@
               </w:rPr>
             </w:pPr>
             <w:r>
-              <w:t xml:space="preserve">30 Berkas Nyata</w:t>
+              <w:t xml:space="preserve">1 Citra Acuan Master (30x Repetisi)</w:t>
             </w:r>
           </w:p>
         </w:tc>
@@ -4795,7 +4801,7 @@
               <w:jc w:val="center"/>
             </w:pPr>
             <w:r>
-              <w:t xml:space="preserve">Sampel Uji Citra</w:t>
+              <w:t xml:space="preserve">Replikasi Pengujian</w:t>
             </w:r>
           </w:p>
         </w:tc>
@@ -4928,7 +4934,7 @@
               </w:rPr>
             </w:pPr>
             <w:r>
-              <w:t xml:space="preserve">30 Berkas Nyata</w:t>
+              <w:t xml:space="preserve">1 Citra Acuan Master (30x Repetisi)</w:t>
             </w:r>
           </w:p>
         </w:tc>
@@ -5068,7 +5074,7 @@
               </w:rPr>
             </w:pPr>
             <w:r>
-              <w:t xml:space="preserve">30 Berkas Nyata</w:t>
+              <w:t xml:space="preserve">1 Citra Acuan Master (30x Repetisi)</w:t>
             </w:r>
           </w:p>
         </w:tc>
@@ -5208,7 +5214,7 @@
               </w:rPr>
             </w:pPr>
             <w:r>
-              <w:t xml:space="preserve">30 Berkas Nyata</w:t>
+              <w:t xml:space="preserve">1 Citra Acuan Master (30x Repetisi)</w:t>
             </w:r>
           </w:p>
         </w:tc>
@@ -5363,7 +5369,7 @@
               </w:rPr>
             </w:pPr>
             <w:r>
-              <w:t xml:space="preserve">30 Berkas Nyata</w:t>
+              <w:t xml:space="preserve">1 Citra Acuan Master (30x Repetisi)</w:t>
             </w:r>
           </w:p>
         </w:tc>
@@ -5801,7 +5807,13 @@
     </w:p>
     <w:p>
       <w:r>
-        <w:t xml:space="preserve">Efektivitas komputasi paralel dievaluasi melalui lima parameter kinerja pada Tabel 4. Waktu eksekusi yang dipakai untuk menghitung percepatan dan efisiensi diperoleh dari nilai rata-rata (mean, μ) beserta standar deviasi (σ) dari pengujian 30 berkas citra independen pada masing-masing kombinasi perlakuan.</w:t>
+        <w:t xml:space="preserve">Efektivitas komputasi paralel dievaluasi melalui lima parameter kinerja pada Tabel 4. Waktu eksekusi yang dipakai untuk menghitung percepatan dan efisiensi diperoleh dari nilai rata-rata (mean, μ) beserta standar deviasi (σ) dari</w:t>
+      </w:r>
+      <w:r>
+        <w:t xml:space="preserve"> 30 kali repetisi pengujian terkontrol</w:t>
+      </w:r>
+      <w:r>
+        <w:t xml:space="preserve"> pada masing-masing kombinasi perlakuan.</w:t>
       </w:r>
     </w:p>
     <w:p/>

</xml_diff>

<commit_message>
fix(bench): eliminate serial cache for interleaved runs, fit empirical Amdahl curve, add 95% CI error bars, and sync proposal text
</commit_message>
<xml_diff>
--- a/Proposal Komputasi Paralel.docx
+++ b/Proposal Komputasi Paralel.docx
@@ -2959,7 +2959,19 @@
         <w:rPr>
           <w:sz w:val="22"/>
         </w:rPr>
-        <w:t xml:space="preserve"> : Durasi beban tambahan sistem paralel akibat pembuatan proses (process spawning), komunikasi antar-proses (IPC), serialisasi data NumPy (pickling), serta rekonstruksi matriks (detik).</w:t>
+        <w:t xml:space="preserve"> : Durasi beban tambahan sistem paralel akibat</w:t>
+      </w:r>
+      <w:r>
+        <w:rPr>
+          <w:sz w:val="22"/>
+        </w:rPr>
+        <w:t xml:space="preserve"> komunikasi antar-proses (IPC), serialisasi data NumPy (pickling), penyalinan baris batas (overlapping halo padding), </w:t>
+      </w:r>
+      <w:r>
+        <w:rPr>
+          <w:sz w:val="22"/>
+        </w:rPr>
+        <w:t xml:space="preserve">serta rekonstruksi matriks (detik).</w:t>
       </w:r>
     </w:p>
     <w:p>
@@ -3380,59 +3392,7 @@
     </w:p>
     <w:p>
       <w:r>
-        <w:t xml:space="preserve">Hukum Amdahl mengasumsikan inti prosesor yang setara. Prosesor uji memiliki arsitektur hibrida (empat </w:t>
-      </w:r>
-      <w:r>
-        <w:rPr>
-          <w:i/>
-          <w:iCs/>
-        </w:rPr>
-        <w:t>performance core</w:t>
-      </w:r>
-      <w:r>
-        <w:t xml:space="preserve"> dan empat </w:t>
-      </w:r>
-      <w:r>
-        <w:rPr>
-          <w:i/>
-          <w:iCs/>
-        </w:rPr>
-        <w:t>efficient core</w:t>
-      </w:r>
-      <w:r>
-        <w:t>), sehingga kurva Amdahl diperlakukan sebagai pendekatan</w:t>
-      </w:r>
-      <w:r>
-        <w:t xml:space="preserve"> teoritis</w:t>
-      </w:r>
-      <w:r>
-        <w:t>.</w:t>
-      </w:r>
-      <w:r>
-        <w:t xml:space="preserve"> </w:t>
-      </w:r>
-      <w:r>
-        <w:t xml:space="preserve">Nilai </w:t>
-      </w:r>
-      <w:r>
-        <w:rPr>
-          <w:i/>
-          <w:iCs/>
-        </w:rPr>
-        <w:t>f</w:t>
-      </w:r>
-      <w:r>
-        <w:t xml:space="preserve"> diperkirakan dari waktu partisi dan penggabungan yang diukur terpisah, lalu dibandingkan dengan nilai </w:t>
-      </w:r>
-      <w:r>
-        <w:rPr>
-          <w:i/>
-          <w:iCs/>
-        </w:rPr>
-        <w:t>f</w:t>
-      </w:r>
-      <w:r>
-        <w:t xml:space="preserve"> hasil pencocokan kurva pada data Skenario B.</w:t>
+        <w:t xml:space="preserve">Hukum Amdahl mengasumsikan inti prosesor yang setara. Prosesor uji memiliki arsitektur hibrida (empat performance core dan empat efficient core), sehingga kurva Amdahl diperlakukan sebagai pendekatan teoritis. Nilai f diestimasi secara empiris melalui metode pencocokan kurva (curve fitting) non-linear dan metrik Karp–Flatt berdasarkan rasio percepatan aktual pada variasi alokasi proses pekerja Skenario B.</w:t>
       </w:r>
     </w:p>
     <w:p>
@@ -3665,7 +3625,13 @@
         <w:t xml:space="preserve">3. Penyiapan dataset citra uji, yaitu </w:t>
       </w:r>
       <w:r>
-        <w:t xml:space="preserve">standardisasi citra acuan master fotografi beresolusi tinggi 4K (4096 × 4096 piksel) yang bersumber dari repositori fotografi terbuka (Aesthetic-4K). Citra acuan master tersebut dipotong secara terpusat (center-crop) tanpa kompresi ke dalam empat tingkatan resolusi spasial: 512 × 512, 1024 × 1024, 2048 × 2048, dan 4096 × 4096 piksel. Pendekatan citra acuan tunggal multiresolusi ini diterapkan guna meniadakan variabilitas struktur piksel antar-berkas, sehingga setiap perlakuan komputasi dievaluasi pada struktur matriks yang konsisten dan terkontrol. Seluruh 30 sampel citra multiresolusi awal tetap diarsipkan sebagai opsi dataset alternatif.</w:t>
+        <w:t xml:space="preserve">standardisasi citra acuan master fotografi beresolusi tinggi 4K (4096 × 4096 piksel) yang bersumber dari repositori fotografi terbuka (Aesthetic-4K). Citra acuan master tersebut dipotong secara terpusat (center-crop) tanpa kompresi ke dalam empat tingkatan resolusi spasial: 512 × 512, 1024 × 1024, 2048 × 2048, dan 4096 × 4096 piksel. </w:t>
+      </w:r>
+      <w:r>
+        <w:t xml:space="preserve">Waktu eksekusi ketiga filter bersifat tidak bergantung pada isi citra (data-independent) karena operasi konvolusi matriks tidak memiliki percabangan kondisional berbasis nilai piksel, sehingga satu citra acuan master memadai untuk meniadakan variabilitas tekstur dan mengisolasi variabilitas sistem komputasi (penjadwalan sistem operasi, fluktuasi termal, dan alokasi inti heterogen).</w:t>
+      </w:r>
+      <w:r>
+        <w:t xml:space="preserve"> Seluruh 30 sampel citra multiresolusi awal tetap diarsipkan sebagai opsi dataset alternatif.</w:t>
       </w:r>
     </w:p>
     <w:p>
@@ -3684,7 +3650,13 @@
         <w:t xml:space="preserve">4. Eksekusi eksperimen terkontrol, yaitu pengujian algoritma pada sistem operasi tanpa aplikasi latar belakang yang membebani CPU. Setiap kombinasi perlakuan pengujian dieksekusi </w:t>
       </w:r>
       <w:r>
-        <w:t xml:space="preserve">sebanyak 30 kali repetisi terkontrol pada masing-masing tingkatan resolusi guna memenuhi kaidah Central Limit Theorem (CLT) untuk memperoleh estimasi parameter rata-rata (mean) dan deviasi standar yang stabil dan representatif. Pengukuran durasi komputasi murni memanfaatkan arsitektur pre-warmed pool untuk meniadakan penalti inisialisasi proses (cold spawn) pada Windows, serta dilengkapi jeda pendinginan termal CPU (cool-down buffer) antar-filter guna mencegah pelambatan termal (thermal throttling).</w:t>
+        <w:t xml:space="preserve">sebanyak 30 kali repetisi terkontrol</w:t>
+      </w:r>
+      <w:r>
+        <w:t xml:space="preserve"> secara selang-seling (interleaved) antara pengukuran serial dan paralel pada masing-masing tingkatan resolusi guna memperoleh estimasi parameter statistik yang stabil dan representatif (median, rerata, simpangan baku, dan selang kepercayaan 95%).</w:t>
+      </w:r>
+      <w:r>
+        <w:t xml:space="preserve"> Pengukuran durasi komputasi murni memanfaatkan arsitektur pre-warmed pool untuk meniadakan penalti inisialisasi proses (cold spawn) pada Windows, serta dilengkapi jeda pendinginan termal CPU (cool-down buffer) antar-filter guna mencegah pelambatan termal (thermal throttling).</w:t>
       </w:r>
     </w:p>
     <w:p>

</xml_diff>